<commit_message>
fix: simplify Word export for Pangea
</commit_message>
<xml_diff>
--- a/assets/piat-revision-template.docx
+++ b/assets/piat-revision-template.docx
@@ -2,275 +2,81 @@
 <file path=word/document.xml><?xml version="1.0" encoding="utf-8"?>
 <w:document xmlns:wpc="http://schemas.microsoft.com/office/word/2010/wordprocessingCanvas" xmlns:mo="http://schemas.microsoft.com/office/mac/office/2008/main" xmlns:mc="http://schemas.openxmlformats.org/markup-compatibility/2006" xmlns:mv="urn:schemas-microsoft-com:mac:vml" xmlns:o="urn:schemas-microsoft-com:office:office" xmlns:r="http://schemas.openxmlformats.org/officeDocument/2006/relationships" xmlns:m="http://schemas.openxmlformats.org/officeDocument/2006/math" xmlns:v="urn:schemas-microsoft-com:vml" xmlns:wp14="http://schemas.microsoft.com/office/word/2010/wordprocessingDrawing" xmlns:wp="http://schemas.openxmlformats.org/drawingml/2006/wordprocessingDrawing" xmlns:w10="urn:schemas-microsoft-com:office:word" xmlns:w="http://schemas.openxmlformats.org/wordprocessingml/2006/main" xmlns:w14="http://schemas.microsoft.com/office/word/2010/wordml" xmlns:wpg="http://schemas.microsoft.com/office/word/2010/wordprocessingGroup" xmlns:wpi="http://schemas.microsoft.com/office/word/2010/wordprocessingInk" xmlns:wne="http://schemas.microsoft.com/office/word/2006/wordml" xmlns:wps="http://schemas.microsoft.com/office/word/2010/wordprocessingShape" mc:Ignorable="w14 wp14">
   <w:body>
-    <w:tbl>
-      <w:tblPr>
-        <w:tblW w:type="auto" w:w="0"/>
-        <w:tblLayout w:type="fixed"/>
-        <w:tblLook w:firstColumn="1" w:firstRow="1" w:lastColumn="0" w:lastRow="0" w:noHBand="0" w:noVBand="1" w:val="04A0"/>
-      </w:tblPr>
-      <w:tblGrid>
-        <w:gridCol w:w="5216"/>
-        <w:gridCol w:w="4706"/>
-      </w:tblGrid>
-      <w:tr>
-        <w:tc>
-          <w:tcPr>
-            <w:tcW w:type="dxa" w:w="5241"/>
-            <w:vAlign w:val="center"/>
-            <w:tcBorders>
-              <w:top w:val="nil"/>
-              <w:bottom w:val="nil"/>
-              <w:left w:val="nil"/>
-              <w:right w:val="nil"/>
-            </w:tcBorders>
-          </w:tcPr>
-          <w:p>
-            <w:pPr>
-              <w:jc w:val="center"/>
-            </w:pPr>
-            <w:r>
-              <w:drawing>
-                <wp:inline xmlns:a="http://schemas.openxmlformats.org/drawingml/2006/main" xmlns:pic="http://schemas.openxmlformats.org/drawingml/2006/picture">
-                  <wp:extent cx="1152000" cy="295513"/>
-                  <wp:docPr id="1" name="Picture 1" descr="Logotipo del centro de atención infantil temprana" title="Logotipo del centro"/>
-                  <wp:cNvGraphicFramePr>
-                    <a:graphicFrameLocks noChangeAspect="1"/>
-                  </wp:cNvGraphicFramePr>
-                  <a:graphic>
-                    <a:graphicData uri="http://schemas.openxmlformats.org/drawingml/2006/picture">
-                      <pic:pic>
-                        <pic:nvPicPr>
-                          <pic:cNvPr id="0" name="image.jpg"/>
-                          <pic:cNvPicPr/>
-                        </pic:nvPicPr>
-                        <pic:blipFill>
-                          <a:blip r:embed="rId9"/>
-                          <a:stretch>
-                            <a:fillRect/>
-                          </a:stretch>
-                        </pic:blipFill>
-                        <pic:spPr>
-                          <a:xfrm>
-                            <a:off x="0" y="0"/>
-                            <a:ext cx="1152000" cy="295513"/>
-                          </a:xfrm>
-                          <a:prstGeom prst="rect"/>
-                        </pic:spPr>
-                      </pic:pic>
-                    </a:graphicData>
-                  </a:graphic>
-                </wp:inline>
-              </w:drawing>
-            </w:r>
-          </w:p>
-          <w:p>
-            <w:pPr>
-              <w:spacing w:after="80" w:line="259" w:lineRule="auto"/>
-              <w:jc w:val="center"/>
-            </w:pPr>
-            <w:r>
-              <w:rPr>
-                <w:rFonts w:ascii="Arial" w:hAnsi="Arial"/>
-                <w:b/>
-                <w:color w:val="464646"/>
-                <w:sz w:val="17"/>
-              </w:rPr>
-              <w:t>CENTRO DE ATENCIÓN INFANTIL TEMPRANA</w:t>
-            </w:r>
-          </w:p>
-        </w:tc>
-        <w:tc>
-          <w:tcPr>
-            <w:tcW w:type="dxa" w:w="5241"/>
-            <w:vAlign w:val="center"/>
-            <w:tcBorders>
-              <w:top w:val="nil"/>
-              <w:bottom w:val="nil"/>
-              <w:left w:val="nil"/>
-              <w:right w:val="nil"/>
-            </w:tcBorders>
-          </w:tcPr>
-          <w:p>
-            <w:pPr>
-              <w:spacing w:after="80" w:line="259" w:lineRule="auto"/>
-            </w:pPr>
-            <w:r>
-              <w:rPr>
-                <w:rFonts w:ascii="Arial" w:hAnsi="Arial"/>
-                <w:b w:val="0"/>
-                <w:sz w:val="17"/>
-              </w:rPr>
-              <w:t xml:space="preserve">N.º Hª: </w:t>
-            </w:r>
-            <w:r>
-              <w:rPr>
-                <w:rFonts w:ascii="Arial" w:hAnsi="Arial"/>
-                <w:b w:val="0"/>
-                <w:sz w:val="17"/>
-              </w:rPr>
-              <w:t>{nh}</w:t>
-            </w:r>
-          </w:p>
-          <w:p>
-            <w:pPr>
-              <w:spacing w:after="80" w:line="259" w:lineRule="auto"/>
-            </w:pPr>
-            <w:r>
-              <w:rPr>
-                <w:rFonts w:ascii="Arial" w:hAnsi="Arial"/>
-                <w:b w:val="0"/>
-                <w:sz w:val="17"/>
-              </w:rPr>
-              <w:t xml:space="preserve">Nombre: </w:t>
-            </w:r>
-            <w:r>
-              <w:rPr>
-                <w:rFonts w:ascii="Arial" w:hAnsi="Arial"/>
-                <w:b w:val="0"/>
-                <w:sz w:val="17"/>
-              </w:rPr>
-              <w:t>{nombre}</w:t>
-            </w:r>
-          </w:p>
-          <w:p>
-            <w:pPr>
-              <w:spacing w:after="80" w:line="259" w:lineRule="auto"/>
-            </w:pPr>
-            <w:r>
-              <w:rPr>
-                <w:rFonts w:ascii="Arial" w:hAnsi="Arial"/>
-                <w:b w:val="0"/>
-                <w:sz w:val="17"/>
-              </w:rPr>
-              <w:t xml:space="preserve">Fecha de nacimiento: </w:t>
-            </w:r>
-            <w:r>
-              <w:rPr>
-                <w:rFonts w:ascii="Arial" w:hAnsi="Arial"/>
-                <w:b w:val="0"/>
-                <w:sz w:val="17"/>
-              </w:rPr>
-              <w:t>{fecha_nacimiento}</w:t>
-            </w:r>
-          </w:p>
-          <w:p>
-            <w:pPr>
-              <w:spacing w:after="80" w:line="259" w:lineRule="auto"/>
-            </w:pPr>
-            <w:r>
-              <w:rPr>
-                <w:rFonts w:ascii="Arial" w:hAnsi="Arial"/>
-                <w:b w:val="0"/>
-                <w:sz w:val="17"/>
-              </w:rPr>
-              <w:t xml:space="preserve">Edad: </w:t>
-            </w:r>
-            <w:r>
-              <w:rPr>
-                <w:rFonts w:ascii="Arial" w:hAnsi="Arial"/>
-                <w:b w:val="0"/>
-                <w:sz w:val="17"/>
-              </w:rPr>
-              <w:t>{edad}</w:t>
-            </w:r>
-          </w:p>
-          <w:p>
-            <w:pPr>
-              <w:spacing w:after="80" w:line="259" w:lineRule="auto"/>
-            </w:pPr>
-            <w:r>
-              <w:rPr>
-                <w:rFonts w:ascii="Arial" w:hAnsi="Arial"/>
-                <w:b w:val="0"/>
-                <w:sz w:val="17"/>
-              </w:rPr>
-              <w:t xml:space="preserve">Sexo: </w:t>
-            </w:r>
-            <w:r>
-              <w:rPr>
-                <w:rFonts w:ascii="Arial" w:hAnsi="Arial"/>
-                <w:b w:val="0"/>
-                <w:sz w:val="17"/>
-              </w:rPr>
-              <w:t>{sexo}</w:t>
-            </w:r>
-          </w:p>
-          <w:p>
-            <w:pPr>
-              <w:spacing w:after="80" w:line="259" w:lineRule="auto"/>
-            </w:pPr>
-            <w:r>
-              <w:rPr>
-                <w:rFonts w:ascii="Arial" w:hAnsi="Arial"/>
-                <w:b w:val="0"/>
-                <w:sz w:val="17"/>
-              </w:rPr>
-              <w:t xml:space="preserve">Fecha del informe: </w:t>
-            </w:r>
-            <w:r>
-              <w:rPr>
-                <w:rFonts w:ascii="Arial" w:hAnsi="Arial"/>
-                <w:b w:val="0"/>
-                <w:sz w:val="17"/>
-              </w:rPr>
-              <w:t>{fecha_informe}</w:t>
-            </w:r>
-          </w:p>
-        </w:tc>
-      </w:tr>
-    </w:tbl>
-    <w:tbl>
-      <w:tblPr>
-        <w:tblW w:type="auto" w:w="0"/>
-        <w:tblLook w:firstColumn="1" w:firstRow="1" w:lastColumn="0" w:lastRow="0" w:noHBand="0" w:noVBand="1" w:val="04A0"/>
-      </w:tblPr>
-      <w:tblGrid>
-        <w:gridCol w:w="10482"/>
-      </w:tblGrid>
-      <w:tr>
-        <w:tc>
-          <w:tcPr>
-            <w:tcW w:type="dxa" w:w="10482"/>
-            <w:tcBorders>
-              <w:top w:val="single" w:sz="8" w:color="1F4E79"/>
-              <w:bottom w:val="single" w:sz="8" w:color="1F4E79"/>
-              <w:left w:val="single" w:sz="8" w:color="1F4E79"/>
-              <w:right w:val="single" w:sz="8" w:color="1F4E79"/>
-            </w:tcBorders>
-            <w:shd w:fill="D9EAF7"/>
-          </w:tcPr>
-          <w:p>
-            <w:pPr>
-              <w:spacing w:after="80" w:line="259" w:lineRule="auto"/>
-              <w:jc w:val="center"/>
-            </w:pPr>
-            <w:r>
-              <w:rPr>
-                <w:rFonts w:ascii="Arial" w:hAnsi="Arial"/>
-                <w:b/>
-                <w:color w:val="1F4E79"/>
-                <w:sz w:val="26"/>
-              </w:rPr>
-              <w:t>PLAN INDIVIDUALIZADO DE ATENCIÓN TEMPRANA</w:t>
-              <w:br/>
-              <w:t>PIAT DE REVISIÓN</w:t>
-            </w:r>
-          </w:p>
-        </w:tc>
-      </w:tr>
-    </w:tbl>
     <w:p>
       <w:pPr>
-        <w:spacing w:before="140" w:after="80" w:line="259" w:lineRule="auto"/>
-        <w:jc w:val="both"/>
+        <w:spacing w:after="240"/>
+        <w:jc w:val="center"/>
       </w:pPr>
       <w:r>
         <w:rPr>
           <w:rFonts w:ascii="Arial" w:hAnsi="Arial"/>
+          <w:b/>
+          <w:color w:val="000000"/>
+          <w:sz w:val="26"/>
+        </w:rPr>
+        <w:t>PIAT DE REVISIÓN</w:t>
+      </w:r>
+    </w:p>
+    <w:p>
+      <w:pPr>
+        <w:spacing w:after="200"/>
+      </w:pPr>
+      <w:r>
+        <w:rPr>
+          <w:rFonts w:ascii="Arial" w:hAnsi="Arial"/>
+          <w:b/>
+          <w:color w:val="000000"/>
+          <w:sz w:val="20"/>
+        </w:rPr>
+        <w:t xml:space="preserve">Paciente: </w:t>
+      </w:r>
+      <w:r>
+        <w:rPr>
+          <w:rFonts w:ascii="Arial" w:hAnsi="Arial"/>
           <w:b w:val="0"/>
-          <w:sz w:val="19"/>
+          <w:color w:val="000000"/>
+          <w:sz w:val="20"/>
         </w:rPr>
-        <w:t>Documento de revisión elaborado a partir de la ficha longitudinal y de la documentación disponible. Su contenido ha sido revisado por el profesional responsable antes de su uso oficial.</w:t>
+        <w:t>{nombre}</w:t>
+        <w:br/>
+      </w:r>
+      <w:r>
+        <w:rPr>
+          <w:rFonts w:ascii="Arial" w:hAnsi="Arial"/>
+          <w:b/>
+          <w:color w:val="000000"/>
+          <w:sz w:val="20"/>
+        </w:rPr>
+        <w:t xml:space="preserve">NH: </w:t>
+      </w:r>
+      <w:r>
+        <w:rPr>
+          <w:rFonts w:ascii="Arial" w:hAnsi="Arial"/>
+          <w:b w:val="0"/>
+          <w:color w:val="000000"/>
+          <w:sz w:val="20"/>
+        </w:rPr>
+        <w:t>{nh}</w:t>
+        <w:br/>
+      </w:r>
+      <w:r>
+        <w:rPr>
+          <w:rFonts w:ascii="Arial" w:hAnsi="Arial"/>
+          <w:b/>
+          <w:color w:val="000000"/>
+          <w:sz w:val="20"/>
+        </w:rPr>
+        <w:t xml:space="preserve">Fecha del informe: </w:t>
+      </w:r>
+      <w:r>
+        <w:rPr>
+          <w:rFonts w:ascii="Arial" w:hAnsi="Arial"/>
+          <w:b w:val="0"/>
+          <w:color w:val="000000"/>
+          <w:sz w:val="20"/>
+        </w:rPr>
+        <w:t>{fecha_informe}</w:t>
+        <w:br/>
       </w:r>
     </w:p>
     <w:p>
@@ -278,21 +84,26 @@
         <w:pStyle w:val="Heading1"/>
       </w:pPr>
       <w:r>
-        <w:t>1. INFORMACIÓN DIAGNÓSTICA Y MÉDICA</w:t>
+        <w:rPr>
+          <w:rFonts w:ascii="Arial" w:hAnsi="Arial"/>
+          <w:b/>
+          <w:color w:val="000000"/>
+          <w:sz w:val="22"/>
+        </w:rPr>
+        <w:t>INFORMACIÓN DIAGNÓSTICA Y MÉDICA</w:t>
       </w:r>
     </w:p>
     <w:p>
       <w:pPr>
         <w:keepLines w:val="0"/>
         <w:widowControl/>
-        <w:spacing w:after="80" w:line="259" w:lineRule="auto"/>
-        <w:jc w:val="left"/>
       </w:pPr>
       <w:r>
         <w:rPr>
           <w:rFonts w:ascii="Arial" w:hAnsi="Arial"/>
           <w:b w:val="0"/>
-          <w:sz w:val="21"/>
+          <w:color w:val="000000"/>
+          <w:sz w:val="22"/>
         </w:rPr>
         <w:t>{informacion_diagnostica_y_medica}</w:t>
       </w:r>
@@ -302,21 +113,26 @@
         <w:pStyle w:val="Heading1"/>
       </w:pPr>
       <w:r>
-        <w:t>2. ANTECEDENTES PERSONALES</w:t>
+        <w:rPr>
+          <w:rFonts w:ascii="Arial" w:hAnsi="Arial"/>
+          <w:b/>
+          <w:color w:val="000000"/>
+          <w:sz w:val="22"/>
+        </w:rPr>
+        <w:t>ANTECEDENTES PERSONALES</w:t>
       </w:r>
     </w:p>
     <w:p>
       <w:pPr>
         <w:keepLines w:val="0"/>
         <w:widowControl/>
-        <w:spacing w:after="80" w:line="259" w:lineRule="auto"/>
-        <w:jc w:val="left"/>
       </w:pPr>
       <w:r>
         <w:rPr>
           <w:rFonts w:ascii="Arial" w:hAnsi="Arial"/>
           <w:b w:val="0"/>
-          <w:sz w:val="21"/>
+          <w:color w:val="000000"/>
+          <w:sz w:val="22"/>
         </w:rPr>
         <w:t>{antecedentes_personales}</w:t>
       </w:r>
@@ -326,21 +142,26 @@
         <w:pStyle w:val="Heading1"/>
       </w:pPr>
       <w:r>
-        <w:t>3. ANTECEDENTES FAMILIARES</w:t>
+        <w:rPr>
+          <w:rFonts w:ascii="Arial" w:hAnsi="Arial"/>
+          <w:b/>
+          <w:color w:val="000000"/>
+          <w:sz w:val="22"/>
+        </w:rPr>
+        <w:t>ANTECEDENTES FAMILIARES</w:t>
       </w:r>
     </w:p>
     <w:p>
       <w:pPr>
         <w:keepLines w:val="0"/>
         <w:widowControl/>
-        <w:spacing w:after="80" w:line="259" w:lineRule="auto"/>
-        <w:jc w:val="left"/>
       </w:pPr>
       <w:r>
         <w:rPr>
           <w:rFonts w:ascii="Arial" w:hAnsi="Arial"/>
           <w:b w:val="0"/>
-          <w:sz w:val="21"/>
+          <w:color w:val="000000"/>
+          <w:sz w:val="22"/>
         </w:rPr>
         <w:t>{antecedentes_familiares}</w:t>
       </w:r>
@@ -350,21 +171,26 @@
         <w:pStyle w:val="Heading1"/>
       </w:pPr>
       <w:r>
-        <w:t>4. OTROS DATOS DE SALUD</w:t>
+        <w:rPr>
+          <w:rFonts w:ascii="Arial" w:hAnsi="Arial"/>
+          <w:b/>
+          <w:color w:val="000000"/>
+          <w:sz w:val="22"/>
+        </w:rPr>
+        <w:t>OTROS DATOS DE SALUD</w:t>
       </w:r>
     </w:p>
     <w:p>
       <w:pPr>
         <w:keepLines w:val="0"/>
         <w:widowControl/>
-        <w:spacing w:after="80" w:line="259" w:lineRule="auto"/>
-        <w:jc w:val="left"/>
       </w:pPr>
       <w:r>
         <w:rPr>
           <w:rFonts w:ascii="Arial" w:hAnsi="Arial"/>
           <w:b w:val="0"/>
-          <w:sz w:val="21"/>
+          <w:color w:val="000000"/>
+          <w:sz w:val="22"/>
         </w:rPr>
         <w:t>{otros_datos_salud}</w:t>
       </w:r>
@@ -374,21 +200,26 @@
         <w:pStyle w:val="Heading1"/>
       </w:pPr>
       <w:r>
-        <w:t>5. DATOS DE ESCOLARIZACIÓN</w:t>
+        <w:rPr>
+          <w:rFonts w:ascii="Arial" w:hAnsi="Arial"/>
+          <w:b/>
+          <w:color w:val="000000"/>
+          <w:sz w:val="22"/>
+        </w:rPr>
+        <w:t>DATOS DE ESCOLARIZACIÓN</w:t>
       </w:r>
     </w:p>
     <w:p>
       <w:pPr>
         <w:keepLines w:val="0"/>
         <w:widowControl/>
-        <w:spacing w:after="80" w:line="259" w:lineRule="auto"/>
-        <w:jc w:val="left"/>
       </w:pPr>
       <w:r>
         <w:rPr>
           <w:rFonts w:ascii="Arial" w:hAnsi="Arial"/>
           <w:b w:val="0"/>
-          <w:sz w:val="21"/>
+          <w:color w:val="000000"/>
+          <w:sz w:val="22"/>
         </w:rPr>
         <w:t>{datos_escolarizacion}</w:t>
       </w:r>
@@ -398,21 +229,26 @@
         <w:pStyle w:val="Heading1"/>
       </w:pPr>
       <w:r>
-        <w:t>6. ASPECTOS BIOPSICOSOCIALES</w:t>
+        <w:rPr>
+          <w:rFonts w:ascii="Arial" w:hAnsi="Arial"/>
+          <w:b/>
+          <w:color w:val="000000"/>
+          <w:sz w:val="22"/>
+        </w:rPr>
+        <w:t>ASPECTOS BIOPSICOSOCIALES</w:t>
       </w:r>
     </w:p>
     <w:p>
       <w:pPr>
         <w:keepLines w:val="0"/>
         <w:widowControl/>
-        <w:spacing w:after="80" w:line="259" w:lineRule="auto"/>
-        <w:jc w:val="left"/>
       </w:pPr>
       <w:r>
         <w:rPr>
           <w:rFonts w:ascii="Arial" w:hAnsi="Arial"/>
           <w:b w:val="0"/>
-          <w:sz w:val="21"/>
+          <w:color w:val="000000"/>
+          <w:sz w:val="22"/>
         </w:rPr>
         <w:t>{aspectos_biopsicosociales}</w:t>
       </w:r>
@@ -422,21 +258,26 @@
         <w:pStyle w:val="Heading1"/>
       </w:pPr>
       <w:r>
-        <w:t>7. RED DE APOYO PROFESIONAL</w:t>
+        <w:rPr>
+          <w:rFonts w:ascii="Arial" w:hAnsi="Arial"/>
+          <w:b/>
+          <w:color w:val="000000"/>
+          <w:sz w:val="22"/>
+        </w:rPr>
+        <w:t>RED DE APOYO PROFESIONAL</w:t>
       </w:r>
     </w:p>
     <w:p>
       <w:pPr>
         <w:keepLines w:val="0"/>
         <w:widowControl/>
-        <w:spacing w:after="80" w:line="259" w:lineRule="auto"/>
-        <w:jc w:val="left"/>
       </w:pPr>
       <w:r>
         <w:rPr>
           <w:rFonts w:ascii="Arial" w:hAnsi="Arial"/>
           <w:b w:val="0"/>
-          <w:sz w:val="21"/>
+          <w:color w:val="000000"/>
+          <w:sz w:val="22"/>
         </w:rPr>
         <w:t>{red_apoyo_profesional}</w:t>
       </w:r>
@@ -446,21 +287,26 @@
         <w:pStyle w:val="Heading1"/>
       </w:pPr>
       <w:r>
-        <w:t>8. EXPLORACIÓN Y PRUEBAS</w:t>
+        <w:rPr>
+          <w:rFonts w:ascii="Arial" w:hAnsi="Arial"/>
+          <w:b/>
+          <w:color w:val="000000"/>
+          <w:sz w:val="22"/>
+        </w:rPr>
+        <w:t>EXPLORACIÓN Y PRUEBAS</w:t>
       </w:r>
     </w:p>
     <w:p>
       <w:pPr>
         <w:keepLines w:val="0"/>
         <w:widowControl/>
-        <w:spacing w:after="80" w:line="259" w:lineRule="auto"/>
-        <w:jc w:val="left"/>
       </w:pPr>
       <w:r>
         <w:rPr>
           <w:rFonts w:ascii="Arial" w:hAnsi="Arial"/>
           <w:b w:val="0"/>
-          <w:sz w:val="21"/>
+          <w:color w:val="000000"/>
+          <w:sz w:val="22"/>
         </w:rPr>
         <w:t>{exploracion_pruebas}</w:t>
       </w:r>
@@ -470,21 +316,26 @@
         <w:pStyle w:val="Heading1"/>
       </w:pPr>
       <w:r>
-        <w:t>9. INTERPRETACIÓN DE LA EVOLUCIÓN</w:t>
+        <w:rPr>
+          <w:rFonts w:ascii="Arial" w:hAnsi="Arial"/>
+          <w:b/>
+          <w:color w:val="000000"/>
+          <w:sz w:val="22"/>
+        </w:rPr>
+        <w:t>INTERPRETACIÓN DE LA EVOLUCIÓN</w:t>
       </w:r>
     </w:p>
     <w:p>
       <w:pPr>
         <w:keepLines w:val="0"/>
         <w:widowControl/>
-        <w:spacing w:after="80" w:line="259" w:lineRule="auto"/>
-        <w:jc w:val="left"/>
       </w:pPr>
       <w:r>
         <w:rPr>
           <w:rFonts w:ascii="Arial" w:hAnsi="Arial"/>
           <w:b w:val="0"/>
-          <w:sz w:val="21"/>
+          <w:color w:val="000000"/>
+          <w:sz w:val="22"/>
         </w:rPr>
         <w:t>{interpretacion_evolucion}</w:t>
       </w:r>
@@ -494,21 +345,26 @@
         <w:pStyle w:val="Heading1"/>
       </w:pPr>
       <w:r>
-        <w:t>10. EXPLORACIÓN CUALITATIVA</w:t>
+        <w:rPr>
+          <w:rFonts w:ascii="Arial" w:hAnsi="Arial"/>
+          <w:b/>
+          <w:color w:val="000000"/>
+          <w:sz w:val="22"/>
+        </w:rPr>
+        <w:t>EXPLORACIÓN CUALITATIVA</w:t>
       </w:r>
     </w:p>
     <w:p>
       <w:pPr>
         <w:keepLines w:val="0"/>
         <w:widowControl/>
-        <w:spacing w:after="80" w:line="259" w:lineRule="auto"/>
-        <w:jc w:val="left"/>
       </w:pPr>
       <w:r>
         <w:rPr>
           <w:rFonts w:ascii="Arial" w:hAnsi="Arial"/>
           <w:b w:val="0"/>
-          <w:sz w:val="21"/>
+          <w:color w:val="000000"/>
+          <w:sz w:val="22"/>
         </w:rPr>
         <w:t>{exploracion_cualitativa}</w:t>
       </w:r>
@@ -518,21 +374,26 @@
         <w:pStyle w:val="Heading1"/>
       </w:pPr>
       <w:r>
-        <w:t>11. PREOCUPACIONES DE LA FAMILIA</w:t>
+        <w:rPr>
+          <w:rFonts w:ascii="Arial" w:hAnsi="Arial"/>
+          <w:b/>
+          <w:color w:val="000000"/>
+          <w:sz w:val="22"/>
+        </w:rPr>
+        <w:t>PREOCUPACIONES DE LA FAMILIA</w:t>
       </w:r>
     </w:p>
     <w:p>
       <w:pPr>
         <w:keepLines w:val="0"/>
         <w:widowControl/>
-        <w:spacing w:after="80" w:line="259" w:lineRule="auto"/>
-        <w:jc w:val="left"/>
       </w:pPr>
       <w:r>
         <w:rPr>
           <w:rFonts w:ascii="Arial" w:hAnsi="Arial"/>
           <w:b w:val="0"/>
-          <w:sz w:val="21"/>
+          <w:color w:val="000000"/>
+          <w:sz w:val="22"/>
         </w:rPr>
         <w:t>{preocupaciones_familia}</w:t>
       </w:r>
@@ -542,21 +403,26 @@
         <w:pStyle w:val="Heading1"/>
       </w:pPr>
       <w:r>
-        <w:t>12. OBJETIVOS CONSEGUIDOS</w:t>
+        <w:rPr>
+          <w:rFonts w:ascii="Arial" w:hAnsi="Arial"/>
+          <w:b/>
+          <w:color w:val="000000"/>
+          <w:sz w:val="22"/>
+        </w:rPr>
+        <w:t>OBJETIVOS CONSEGUIDOS</w:t>
       </w:r>
     </w:p>
     <w:p>
       <w:pPr>
         <w:keepLines w:val="0"/>
         <w:widowControl/>
-        <w:spacing w:after="80" w:line="259" w:lineRule="auto"/>
-        <w:jc w:val="left"/>
       </w:pPr>
       <w:r>
         <w:rPr>
           <w:rFonts w:ascii="Arial" w:hAnsi="Arial"/>
           <w:b w:val="0"/>
-          <w:sz w:val="21"/>
+          <w:color w:val="000000"/>
+          <w:sz w:val="22"/>
         </w:rPr>
         <w:t>{objetivos_conseguidos}</w:t>
       </w:r>
@@ -566,21 +432,26 @@
         <w:pStyle w:val="Heading1"/>
       </w:pPr>
       <w:r>
-        <w:t>13. OBJETIVOS EN PROCESO</w:t>
+        <w:rPr>
+          <w:rFonts w:ascii="Arial" w:hAnsi="Arial"/>
+          <w:b/>
+          <w:color w:val="000000"/>
+          <w:sz w:val="22"/>
+        </w:rPr>
+        <w:t>OBJETIVOS EN PROCESO</w:t>
       </w:r>
     </w:p>
     <w:p>
       <w:pPr>
         <w:keepLines w:val="0"/>
         <w:widowControl/>
-        <w:spacing w:after="80" w:line="259" w:lineRule="auto"/>
-        <w:jc w:val="left"/>
       </w:pPr>
       <w:r>
         <w:rPr>
           <w:rFonts w:ascii="Arial" w:hAnsi="Arial"/>
           <w:b w:val="0"/>
-          <w:sz w:val="21"/>
+          <w:color w:val="000000"/>
+          <w:sz w:val="22"/>
         </w:rPr>
         <w:t>{objetivos_en_proceso}</w:t>
       </w:r>
@@ -590,21 +461,26 @@
         <w:pStyle w:val="Heading1"/>
       </w:pPr>
       <w:r>
-        <w:t>14. OBJETIVOS PROPUESTOS</w:t>
+        <w:rPr>
+          <w:rFonts w:ascii="Arial" w:hAnsi="Arial"/>
+          <w:b/>
+          <w:color w:val="000000"/>
+          <w:sz w:val="22"/>
+        </w:rPr>
+        <w:t>OBJETIVOS PROPUESTOS</w:t>
       </w:r>
     </w:p>
     <w:p>
       <w:pPr>
         <w:keepLines w:val="0"/>
         <w:widowControl/>
-        <w:spacing w:after="80" w:line="259" w:lineRule="auto"/>
-        <w:jc w:val="left"/>
       </w:pPr>
       <w:r>
         <w:rPr>
           <w:rFonts w:ascii="Arial" w:hAnsi="Arial"/>
           <w:b w:val="0"/>
-          <w:sz w:val="21"/>
+          <w:color w:val="000000"/>
+          <w:sz w:val="22"/>
         </w:rPr>
         <w:t>{objetivos_actuales}</w:t>
       </w:r>
@@ -614,21 +490,26 @@
         <w:pStyle w:val="Heading1"/>
       </w:pPr>
       <w:r>
-        <w:t>15. ACTUACIONES CON LA FAMILIA</w:t>
+        <w:rPr>
+          <w:rFonts w:ascii="Arial" w:hAnsi="Arial"/>
+          <w:b/>
+          <w:color w:val="000000"/>
+          <w:sz w:val="22"/>
+        </w:rPr>
+        <w:t>ACTUACIONES CON LA FAMILIA</w:t>
       </w:r>
     </w:p>
     <w:p>
       <w:pPr>
         <w:keepLines w:val="0"/>
         <w:widowControl/>
-        <w:spacing w:after="80" w:line="259" w:lineRule="auto"/>
-        <w:jc w:val="left"/>
       </w:pPr>
       <w:r>
         <w:rPr>
           <w:rFonts w:ascii="Arial" w:hAnsi="Arial"/>
           <w:b w:val="0"/>
-          <w:sz w:val="21"/>
+          <w:color w:val="000000"/>
+          <w:sz w:val="22"/>
         </w:rPr>
         <w:t>{familia}</w:t>
       </w:r>
@@ -638,21 +519,26 @@
         <w:pStyle w:val="Heading1"/>
       </w:pPr>
       <w:r>
-        <w:t>16. ACTUACIONES EN EL ENTORNO</w:t>
+        <w:rPr>
+          <w:rFonts w:ascii="Arial" w:hAnsi="Arial"/>
+          <w:b/>
+          <w:color w:val="000000"/>
+          <w:sz w:val="22"/>
+        </w:rPr>
+        <w:t>ACTUACIONES EN EL ENTORNO</w:t>
       </w:r>
     </w:p>
     <w:p>
       <w:pPr>
         <w:keepLines w:val="0"/>
         <w:widowControl/>
-        <w:spacing w:after="80" w:line="259" w:lineRule="auto"/>
-        <w:jc w:val="left"/>
       </w:pPr>
       <w:r>
         <w:rPr>
           <w:rFonts w:ascii="Arial" w:hAnsi="Arial"/>
           <w:b w:val="0"/>
-          <w:sz w:val="21"/>
+          <w:color w:val="000000"/>
+          <w:sz w:val="22"/>
         </w:rPr>
         <w:t>{entorno}</w:t>
       </w:r>
@@ -662,21 +548,26 @@
         <w:pStyle w:val="Heading1"/>
       </w:pPr>
       <w:r>
-        <w:t>17. ACTUACIONES PROFESIONALES</w:t>
+        <w:rPr>
+          <w:rFonts w:ascii="Arial" w:hAnsi="Arial"/>
+          <w:b/>
+          <w:color w:val="000000"/>
+          <w:sz w:val="22"/>
+        </w:rPr>
+        <w:t>ACTUACIONES PROFESIONALES</w:t>
       </w:r>
     </w:p>
     <w:p>
       <w:pPr>
         <w:keepLines w:val="0"/>
         <w:widowControl/>
-        <w:spacing w:after="80" w:line="259" w:lineRule="auto"/>
-        <w:jc w:val="left"/>
       </w:pPr>
       <w:r>
         <w:rPr>
           <w:rFonts w:ascii="Arial" w:hAnsi="Arial"/>
           <w:b w:val="0"/>
-          <w:sz w:val="21"/>
+          <w:color w:val="000000"/>
+          <w:sz w:val="22"/>
         </w:rPr>
         <w:t>{profesionales}</w:t>
       </w:r>
@@ -686,21 +577,26 @@
         <w:pStyle w:val="Heading1"/>
       </w:pPr>
       <w:r>
-        <w:t>18. SESIONES PAUTADAS</w:t>
+        <w:rPr>
+          <w:rFonts w:ascii="Arial" w:hAnsi="Arial"/>
+          <w:b/>
+          <w:color w:val="000000"/>
+          <w:sz w:val="22"/>
+        </w:rPr>
+        <w:t>SESIONES PAUTADAS</w:t>
       </w:r>
     </w:p>
     <w:p>
       <w:pPr>
         <w:keepLines w:val="0"/>
         <w:widowControl/>
-        <w:spacing w:after="80" w:line="259" w:lineRule="auto"/>
-        <w:jc w:val="left"/>
       </w:pPr>
       <w:r>
         <w:rPr>
           <w:rFonts w:ascii="Arial" w:hAnsi="Arial"/>
           <w:b w:val="0"/>
-          <w:sz w:val="21"/>
+          <w:color w:val="000000"/>
+          <w:sz w:val="22"/>
         </w:rPr>
         <w:t>{sesiones_pautadas}</w:t>
       </w:r>
@@ -710,192 +606,38 @@
         <w:pStyle w:val="Heading1"/>
       </w:pPr>
       <w:r>
-        <w:t>19. MATERIALES Y RECURSOS</w:t>
+        <w:rPr>
+          <w:rFonts w:ascii="Arial" w:hAnsi="Arial"/>
+          <w:b/>
+          <w:color w:val="000000"/>
+          <w:sz w:val="22"/>
+        </w:rPr>
+        <w:t>MATERIALES Y RECURSOS</w:t>
       </w:r>
     </w:p>
     <w:p>
       <w:pPr>
         <w:keepLines w:val="0"/>
         <w:widowControl/>
-        <w:spacing w:after="80" w:line="259" w:lineRule="auto"/>
-        <w:jc w:val="left"/>
       </w:pPr>
       <w:r>
         <w:rPr>
           <w:rFonts w:ascii="Arial" w:hAnsi="Arial"/>
           <w:b w:val="0"/>
-          <w:sz w:val="21"/>
+          <w:color w:val="000000"/>
+          <w:sz w:val="22"/>
         </w:rPr>
         <w:t>{materiales_recursos}</w:t>
       </w:r>
     </w:p>
-    <w:p>
-      <w:pPr>
-        <w:pStyle w:val="Heading1"/>
-      </w:pPr>
-      <w:r>
-        <w:t>VALIDACIÓN PROFESIONAL Y FAMILIAR</w:t>
-      </w:r>
-    </w:p>
-    <w:tbl>
-      <w:tblPr>
-        <w:tblW w:type="auto" w:w="0"/>
-        <w:tblLayout w:type="fixed"/>
-        <w:tblLook w:firstColumn="1" w:firstRow="1" w:lastColumn="0" w:lastRow="0" w:noHBand="0" w:noVBand="1" w:val="04A0"/>
-      </w:tblPr>
-      <w:tblGrid>
-        <w:gridCol w:w="5241"/>
-        <w:gridCol w:w="5241"/>
-      </w:tblGrid>
-      <w:tr>
-        <w:trPr>
-          <w:tblHeader w:val="true"/>
-        </w:trPr>
-        <w:tc>
-          <w:tcPr>
-            <w:tcW w:type="dxa" w:w="5241"/>
-            <w:shd w:fill="D9EAF7"/>
-            <w:tcBorders>
-              <w:top w:val="single" w:sz="4" w:color="7F8C8D"/>
-              <w:bottom w:val="single" w:sz="4" w:color="7F8C8D"/>
-              <w:left w:val="single" w:sz="4" w:color="7F8C8D"/>
-              <w:right w:val="single" w:sz="4" w:color="7F8C8D"/>
-            </w:tcBorders>
-          </w:tcPr>
-          <w:p>
-            <w:pPr>
-              <w:spacing w:after="80" w:line="259" w:lineRule="auto"/>
-              <w:jc w:val="center"/>
-            </w:pPr>
-            <w:r>
-              <w:rPr>
-                <w:rFonts w:ascii="Arial" w:hAnsi="Arial"/>
-                <w:b/>
-                <w:color w:val="1F4E79"/>
-                <w:sz w:val="19"/>
-              </w:rPr>
-              <w:t>Profesional responsable</w:t>
-            </w:r>
-          </w:p>
-        </w:tc>
-        <w:tc>
-          <w:tcPr>
-            <w:tcW w:type="dxa" w:w="5241"/>
-            <w:shd w:fill="D9EAF7"/>
-            <w:tcBorders>
-              <w:top w:val="single" w:sz="4" w:color="7F8C8D"/>
-              <w:bottom w:val="single" w:sz="4" w:color="7F8C8D"/>
-              <w:left w:val="single" w:sz="4" w:color="7F8C8D"/>
-              <w:right w:val="single" w:sz="4" w:color="7F8C8D"/>
-            </w:tcBorders>
-          </w:tcPr>
-          <w:p>
-            <w:pPr>
-              <w:spacing w:after="80" w:line="259" w:lineRule="auto"/>
-              <w:jc w:val="center"/>
-            </w:pPr>
-            <w:r>
-              <w:rPr>
-                <w:rFonts w:ascii="Arial" w:hAnsi="Arial"/>
-                <w:b/>
-                <w:color w:val="1F4E79"/>
-                <w:sz w:val="19"/>
-              </w:rPr>
-              <w:t>Familia / representantes legales</w:t>
-            </w:r>
-          </w:p>
-        </w:tc>
-      </w:tr>
-      <w:tr>
-        <w:tc>
-          <w:tcPr>
-            <w:tcW w:type="dxa" w:w="5241"/>
-            <w:tcBorders>
-              <w:top w:val="single" w:sz="4" w:color="7F8C8D"/>
-              <w:bottom w:val="single" w:sz="4" w:color="7F8C8D"/>
-              <w:left w:val="single" w:sz="4" w:color="7F8C8D"/>
-              <w:right w:val="single" w:sz="4" w:color="7F8C8D"/>
-            </w:tcBorders>
-            <w:vAlign w:val="top"/>
-          </w:tcPr>
-          <w:p>
-            <w:pPr>
-              <w:spacing w:after="80" w:line="259" w:lineRule="auto"/>
-            </w:pPr>
-            <w:r>
-              <w:rPr>
-                <w:rFonts w:ascii="Arial" w:hAnsi="Arial"/>
-                <w:b w:val="0"/>
-                <w:sz w:val="19"/>
-              </w:rPr>
-              <w:t>Nombre y firma:</w:t>
-              <w:br/>
-              <w:br/>
-              <w:br/>
-              <w:t>Fecha:</w:t>
-            </w:r>
-          </w:p>
-        </w:tc>
-        <w:tc>
-          <w:tcPr>
-            <w:tcW w:type="dxa" w:w="5241"/>
-            <w:tcBorders>
-              <w:top w:val="single" w:sz="4" w:color="7F8C8D"/>
-              <w:bottom w:val="single" w:sz="4" w:color="7F8C8D"/>
-              <w:left w:val="single" w:sz="4" w:color="7F8C8D"/>
-              <w:right w:val="single" w:sz="4" w:color="7F8C8D"/>
-            </w:tcBorders>
-            <w:vAlign w:val="top"/>
-          </w:tcPr>
-          <w:p>
-            <w:pPr>
-              <w:spacing w:after="80" w:line="259" w:lineRule="auto"/>
-            </w:pPr>
-            <w:r>
-              <w:rPr>
-                <w:rFonts w:ascii="Arial" w:hAnsi="Arial"/>
-                <w:b w:val="0"/>
-                <w:sz w:val="19"/>
-              </w:rPr>
-              <w:t>Nombre y firma:</w:t>
-              <w:br/>
-              <w:br/>
-              <w:br/>
-              <w:t>Fecha:</w:t>
-            </w:r>
-          </w:p>
-        </w:tc>
-      </w:tr>
-    </w:tbl>
     <w:sectPr>
-      <w:footerReference w:type="default" r:id="rId10"/>
       <w:pgSz w:w="12240" w:h="15840"/>
-      <w:pgMar w:top="765" w:right="879" w:bottom="765" w:left="879" w:header="283" w:footer="369" w:gutter="0"/>
+      <w:pgMar w:top="1134" w:right="1247" w:bottom="1134" w:left="1247" w:header="720" w:footer="720" w:gutter="0"/>
       <w:cols w:space="720"/>
       <w:docGrid w:linePitch="360"/>
     </w:sectPr>
   </w:body>
 </w:document>
-</file>
-
-<file path=word/footer1.xml><?xml version="1.0" encoding="utf-8"?>
-<w:ftr xmlns:m="http://schemas.openxmlformats.org/officeDocument/2006/math" xmlns:mc="http://schemas.openxmlformats.org/markup-compatibility/2006" xmlns:mo="http://schemas.microsoft.com/office/mac/office/2008/main" xmlns:mv="urn:schemas-microsoft-com:mac:vml" xmlns:o="urn:schemas-microsoft-com:office:office" xmlns:r="http://schemas.openxmlformats.org/officeDocument/2006/relationships" xmlns:v="urn:schemas-microsoft-com:vml" xmlns:w10="urn:schemas-microsoft-com:office:word" xmlns:w14="http://schemas.microsoft.com/office/word/2010/wordml" xmlns:w="http://schemas.openxmlformats.org/wordprocessingml/2006/main" xmlns:wne="http://schemas.microsoft.com/office/word/2006/wordml" xmlns:wp14="http://schemas.microsoft.com/office/word/2010/wordprocessingDrawing" xmlns:wp="http://schemas.openxmlformats.org/drawingml/2006/wordprocessingDrawing" xmlns:wpc="http://schemas.microsoft.com/office/word/2010/wordprocessingCanvas" xmlns:wpg="http://schemas.microsoft.com/office/word/2010/wordprocessingGroup" xmlns:wpi="http://schemas.microsoft.com/office/word/2010/wordprocessingInk" xmlns:wps="http://schemas.microsoft.com/office/word/2010/wordprocessingShape" mc:Ignorable="w14 wp14">
-  <w:p>
-    <w:pPr>
-      <w:pStyle w:val="Footer"/>
-      <w:jc w:val="center"/>
-    </w:pPr>
-    <w:r>
-      <w:rPr>
-        <w:rFonts w:ascii="Arial" w:hAnsi="Arial"/>
-        <w:sz w:val="16"/>
-      </w:rPr>
-      <w:fldChar w:fldCharType="begin"/>
-      <w:instrText xml:space="preserve"> PAGE </w:instrText>
-      <w:fldChar w:fldCharType="end"/>
-    </w:r>
-  </w:p>
-</w:ftr>
 </file>
 
 <file path=word/numbering.xml><?xml version="1.0" encoding="utf-8"?>
@@ -1262,11 +1004,12 @@
     <w:qFormat/>
     <w:rsid w:val="00FC693F"/>
     <w:pPr>
-      <w:spacing w:after="80" w:line="259" w:lineRule="auto"/>
+      <w:spacing w:after="120" w:line="276" w:lineRule="auto"/>
     </w:pPr>
     <w:rPr>
       <w:rFonts w:ascii="Arial" w:hAnsi="Arial"/>
-      <w:sz w:val="21"/>
+      <w:color w:val="000000"/>
+      <w:sz w:val="22"/>
     </w:rPr>
   </w:style>
   <w:style w:type="paragraph" w:styleId="Header">
@@ -1324,15 +1067,15 @@
     <w:pPr>
       <w:keepNext/>
       <w:keepLines/>
-      <w:spacing w:before="160" w:after="60"/>
+      <w:spacing w:before="200" w:after="60"/>
       <w:outlineLvl w:val="0"/>
     </w:pPr>
     <w:rPr>
       <w:rFonts w:asciiTheme="majorHAnsi" w:eastAsiaTheme="majorEastAsia" w:hAnsiTheme="majorHAnsi" w:cstheme="majorBidi" w:ascii="Arial" w:hAnsi="Arial"/>
       <w:b/>
       <w:bCs/>
-      <w:color w:val="1F4E79"/>
-      <w:sz w:val="24"/>
+      <w:color w:val="000000"/>
+      <w:sz w:val="22"/>
       <w:szCs w:val="28"/>
     </w:rPr>
   </w:style>
@@ -1348,15 +1091,15 @@
     <w:pPr>
       <w:keepNext/>
       <w:keepLines/>
-      <w:spacing w:before="160" w:after="60"/>
+      <w:spacing w:before="200" w:after="0"/>
       <w:outlineLvl w:val="1"/>
     </w:pPr>
     <w:rPr>
-      <w:rFonts w:asciiTheme="majorHAnsi" w:eastAsiaTheme="majorEastAsia" w:hAnsiTheme="majorHAnsi" w:cstheme="majorBidi" w:ascii="Arial" w:hAnsi="Arial"/>
+      <w:rFonts w:asciiTheme="majorHAnsi" w:eastAsiaTheme="majorEastAsia" w:hAnsiTheme="majorHAnsi" w:cstheme="majorBidi"/>
       <w:b/>
       <w:bCs/>
-      <w:color w:val="1F4E79"/>
-      <w:sz w:val="22"/>
+      <w:color w:val="4F81BD" w:themeColor="accent1"/>
+      <w:sz w:val="26"/>
       <w:szCs w:val="26"/>
     </w:rPr>
   </w:style>

</xml_diff>